<commit_message>
Complete data audit: 197/199 markets fully scored, update Data Sources doc
Coverage after today's pipeline overhaul:
- Permits (Census BPS direct): 197/199
- Employment (BLS CES v2): 199/199
- Unemployment (BLS LAUS v2): 198/199
- Population (Census PEP CSV): 197/199
- Income (Census ACS): 199/199
- QCEW trade wages: 199/199 (52 metro + 147 state proxy)
- Zillow ZHVI: 195/199
- FHFA HPI: 197/199
- All 3 sub-scores: 199/199

Updated StrategemSignal_Data_Sources.docx with:
- New direct API sources (BLS v2, Census PEP CSV, Census BPS)
- FRED demoted to legacy fallback
- QCEW state-level proxy documented
- Coverage gaps section rewritten with current numbers
- All pipeline/cron references updated

Co-Authored-By: Claude Opus 4.6 (1M context) <noreply@anthropic.com>
</commit_message>
<xml_diff>
--- a/StrategemSignal_Data_Sources.docx
+++ b/StrategemSignal_Data_Sources.docx
@@ -379,7 +379,7 @@
                 <w:color w:val="1E293B"/>
                 <w:sz w:val="18"/>
               </w:rPr>
-              <w:t>Monthly single-family residential building permits by metro. Primary signal for home-construction demand.</w:t>
+              <w:t>Monthly single-family + multi-family residential building permits by metro. Primary signal for home-construction demand. Direct XLS download from Census (not FRED mirror).</w:t>
             </w:r>
           </w:p>
         </w:tc>
@@ -431,7 +431,7 @@
                 <w:color w:val="1E293B"/>
                 <w:sz w:val="18"/>
               </w:rPr>
-              <w:t>demand-pipeline.ts · demand-data.yml · /api/cron/demand</w:t>
+              <w:t>census-bps-client.ts · demand-pipeline.ts · demand-data.yml · /api/cron/demand</w:t>
             </w:r>
           </w:p>
         </w:tc>
@@ -483,7 +483,7 @@
                 <w:color w:val="1E293B"/>
                 <w:sz w:val="18"/>
               </w:rPr>
-              <w:t>Filter 1 (Migration + Demand), Portfolio Health Demand sub-score, market narratives</w:t>
+              <w:t>Portfolio Health Demand sub-score (permits YoY at 30% weight), Filter 3 (Supply-Demand Imbalance), market narratives</w:t>
             </w:r>
           </w:p>
         </w:tc>
@@ -509,7 +509,7 @@
                 <w:color w:val="1E293B"/>
                 <w:sz w:val="18"/>
               </w:rPr>
-              <w:t>Some metros publish quarterly rather than monthly — permits for those lag by ~30 days</w:t>
+              <w:t>197/199 markets covered (2 PR metros excluded). Some metros publish quarterly rather than monthly — permits for those lag by ~30 days.</w:t>
             </w:r>
           </w:p>
         </w:tc>
@@ -645,7 +645,7 @@
                 <w:color w:val="1E293B"/>
                 <w:sz w:val="18"/>
               </w:rPr>
-              <w:t>income-pipeline.ts · /api/cron/income (manual/annual)</w:t>
+              <w:t>income-pipeline.ts · /api/cron/income</w:t>
             </w:r>
           </w:p>
         </w:tc>
@@ -699,7 +699,7 @@
                 <w:color w:val="1E293B"/>
                 <w:sz w:val="18"/>
               </w:rPr>
-              <w:t>Filter 5 (Affordability Runway), Portfolio Health Financial sub-score</w:t>
+              <w:t>Filter 5 (Affordability Runway), Portfolio Health Financial sub-score (income YoY at 60% weight, level at 40%)</w:t>
             </w:r>
           </w:p>
         </w:tc>
@@ -726,7 +726,7 @@
                 <w:color w:val="1E293B"/>
                 <w:sz w:val="18"/>
               </w:rPr>
-              <w:t>One-year lag is structural; no fix available. Rural metros have wider confidence intervals.</w:t>
+              <w:t>199/199 markets covered. One-year lag is structural; no fix available.</w:t>
             </w:r>
           </w:p>
         </w:tc>
@@ -807,7 +807,7 @@
                 <w:color w:val="1E293B"/>
                 <w:sz w:val="18"/>
               </w:rPr>
-              <w:t>Annual population change and net domestic migration by metro.</w:t>
+              <w:t>Annual population estimates and net domestic migration by metro. Direct CSV download from Census servers (the API was discontinued for MSAs post-2019, but the same data is published as files).</w:t>
             </w:r>
           </w:p>
         </w:tc>
@@ -833,7 +833,7 @@
                 <w:color w:val="1E293B"/>
                 <w:sz w:val="18"/>
               </w:rPr>
-              <w:t>Annual (typ. March release)</w:t>
+              <w:t>Annual · new vintage published Dec-March</w:t>
             </w:r>
           </w:p>
         </w:tc>
@@ -859,7 +859,7 @@
                 <w:color w:val="1E293B"/>
                 <w:sz w:val="18"/>
               </w:rPr>
-              <w:t>demand-pipeline.ts (merged with permits run) · demand-data.yml</w:t>
+              <w:t>census-pep-client.ts · demand-pipeline.ts · demand-data.yml</w:t>
             </w:r>
           </w:p>
         </w:tc>
@@ -911,7 +911,7 @@
                 <w:color w:val="1E293B"/>
                 <w:sz w:val="18"/>
               </w:rPr>
-              <w:t>Filter 1 (Migration + Demand), Portfolio Health Demand sub-score</w:t>
+              <w:t>Filter 1 (Migration Tailwinds — migration as % of population), Portfolio Health Demand sub-score (population change at 25% weight)</w:t>
             </w:r>
           </w:p>
         </w:tc>
@@ -937,7 +937,7 @@
                 <w:color w:val="1E293B"/>
                 <w:sz w:val="18"/>
               </w:rPr>
-              <w:t>Annual only; no monthly granularity available from Census</w:t>
+              <w:t>197/199 markets covered (2 PR metros excluded from Census metro CSV). 5 years of annual data per vintage (2020-2024). Cleveland requires CBSA override (17460→17410).</w:t>
             </w:r>
           </w:p>
         </w:tc>
@@ -1019,7 +1019,7 @@
                 <w:color w:val="1E293B"/>
                 <w:sz w:val="18"/>
               </w:rPr>
-              <w:t>Total nonfarm employment by metro, month-over-month and year-over-year change.</w:t>
+              <w:t>Total nonfarm employment by metro, month-over-month and year-over-year change. Direct BLS v2 API (not FRED mirror).</w:t>
             </w:r>
           </w:p>
         </w:tc>
@@ -1073,7 +1073,7 @@
                 <w:color w:val="1E293B"/>
                 <w:sz w:val="18"/>
               </w:rPr>
-              <w:t>demand-pipeline.ts · demand-data.yml · /api/cron/demand (via FRED mirror)</w:t>
+              <w:t>bls-v2-client.ts · demand-pipeline.ts · demand-data.yml · /api/cron/demand</w:t>
             </w:r>
           </w:p>
         </w:tc>
@@ -1127,7 +1127,7 @@
                 <w:color w:val="1E293B"/>
                 <w:sz w:val="18"/>
               </w:rPr>
-              <w:t>Filter 1 (Migration + Demand), Portfolio Health Demand sub-score</w:t>
+              <w:t>Portfolio Health Demand sub-score (employment YoY at 25% weight)</w:t>
             </w:r>
           </w:p>
         </w:tc>
@@ -1154,7 +1154,7 @@
                 <w:color w:val="1E293B"/>
                 <w:sz w:val="18"/>
               </w:rPr>
-              <w:t>FRED mirror publishes ~15 days after BLS; we accept that lag in exchange for rate limits</w:t>
+              <w:t>199/199 markets covered. BLS v2 API series ID: SMS{stateFips}{cbsaFips}0000000001. 500 queries/day limit (registered key).</w:t>
             </w:r>
           </w:p>
         </w:tc>
@@ -1235,7 +1235,7 @@
                 <w:color w:val="1E293B"/>
                 <w:sz w:val="18"/>
               </w:rPr>
-              <w:t>Unemployment rate by metro.</w:t>
+              <w:t>Unemployment rate by metro. Direct BLS v2 API.</w:t>
             </w:r>
           </w:p>
         </w:tc>
@@ -1287,7 +1287,7 @@
                 <w:color w:val="1E293B"/>
                 <w:sz w:val="18"/>
               </w:rPr>
-              <w:t>demand-pipeline.ts · demand-data.yml · fred-client.ts</w:t>
+              <w:t>bls-v2-client.ts · demand-pipeline.ts · demand-data.yml</w:t>
             </w:r>
           </w:p>
         </w:tc>
@@ -1313,7 +1313,7 @@
                 <w:color w:val="1E293B"/>
                 <w:sz w:val="18"/>
               </w:rPr>
-              <w:t>employment_data (same table as CES)</w:t>
+              <w:t>employment_data (unemployment_rate column, same table as CES)</w:t>
             </w:r>
           </w:p>
         </w:tc>
@@ -1339,7 +1339,7 @@
                 <w:color w:val="1E293B"/>
                 <w:sz w:val="18"/>
               </w:rPr>
-              <w:t>Portfolio Health Demand sub-score (inverted)</w:t>
+              <w:t>Portfolio Health Demand sub-score (inverted, 20% weight)</w:t>
             </w:r>
           </w:p>
         </w:tc>
@@ -1365,7 +1365,7 @@
                 <w:color w:val="1E293B"/>
                 <w:sz w:val="18"/>
               </w:rPr>
-              <w:t>Same FRED mirror lag as CES</w:t>
+              <w:t>198/199 markets covered. BLS v2 API series ID: LAUMT{stateFips}{cbsa4digit}000000003. 1 PR metro lacks LAUS coverage.</w:t>
             </w:r>
           </w:p>
         </w:tc>
@@ -1447,7 +1447,7 @@
                 <w:color w:val="1E293B"/>
                 <w:sz w:val="18"/>
               </w:rPr>
-              <w:t>Construction-trade employment (NAICS 2382/2383/2389) and avg weekly wage by metro. Primary capacity signal.</w:t>
+              <w:t>Construction-trade employment (NAICS 2381/2382/2383/2389) and avg weekly wage by metro. Primary capacity signal. Falls back to state-level data when BLS suppresses MSA-level 238x for smaller metros.</w:t>
             </w:r>
           </w:p>
         </w:tc>
@@ -1501,7 +1501,7 @@
                 <w:color w:val="1E293B"/>
                 <w:sz w:val="18"/>
               </w:rPr>
-              <w:t>capacity-pipeline.ts · capacity-data.yml · /api/cron/capacity</w:t>
+              <w:t>qcew-client.ts · capacity-pipeline.ts · capacity-data.yml · /api/cron/capacity</w:t>
             </w:r>
           </w:p>
         </w:tc>
@@ -1555,7 +1555,7 @@
                 <w:color w:val="1E293B"/>
                 <w:sz w:val="18"/>
               </w:rPr>
-              <w:t>Business Case Organic model (wage-adjusted build cost), Filter 6 (Operational Feasibility), Portfolio Health Operational sub-score</w:t>
+              <w:t>Business Case Organic model (wage-adjusted build cost), Filter 6 (Operational Feasibility), Portfolio Health Operational sub-score (wage pressure 60%, employment trajectory 40%)</w:t>
             </w:r>
           </w:p>
         </w:tc>
@@ -1582,7 +1582,7 @@
                 <w:color w:val="1E293B"/>
                 <w:sz w:val="18"/>
               </w:rPr>
-              <w:t>~2-quarter publication lag is structural; single-probe resolution added in Phase 3.1</w:t>
+              <w:t>199/199 markets covered (52 metro-level, 147 state-level proxy). State proxy is less precise but honest — same trade wage trends apply statewide. Quarter probe added to avoid targeting unpublished quarters.</w:t>
             </w:r>
           </w:p>
         </w:tc>
@@ -2471,7 +2471,7 @@
                 <w:color w:val="1E293B"/>
                 <w:sz w:val="18"/>
               </w:rPr>
-              <w:t>4 markets unmatched of 199 (98% coverage): 2 Puerto Rico metros, Dayton-Kettering OH, Prescott Valley-Prescott AZ. No Zillow coverage at all for those.</w:t>
+              <w:t>195/199 markets covered (98%). 4 unmatched: 2 Puerto Rico metros, Dayton-Kettering OH, Prescott Valley-Prescott AZ.</w:t>
             </w:r>
           </w:p>
         </w:tc>
@@ -2553,7 +2553,7 @@
                 <w:color w:val="1E293B"/>
                 <w:sz w:val="18"/>
               </w:rPr>
-              <w:t>Mirror of BLS CES, LAUS, and related employment/population time series. We use FRED because its API is well-documented and rate-friendly.</w:t>
+              <w:t>Legacy fallback for BLS CES/LAUS/population time series. Retained for the original 52 markets with known FRED series IDs. New markets use direct BLS v2 and Census APIs instead.</w:t>
             </w:r>
           </w:p>
         </w:tc>
@@ -2580,7 +2580,7 @@
                 <w:color w:val="1E293B"/>
                 <w:sz w:val="18"/>
               </w:rPr>
-              <w:t>As-needed (demand-pipeline uses it for CES + LAUS)</w:t>
+              <w:t>Legacy — no longer the primary path for any data source</w:t>
             </w:r>
           </w:p>
         </w:tc>
@@ -2607,7 +2607,7 @@
                 <w:color w:val="1E293B"/>
                 <w:sz w:val="18"/>
               </w:rPr>
-              <w:t>fred-client.ts (library used by demand-pipeline)</w:t>
+              <w:t>fred-client.ts (library, retained for backward compatibility)</w:t>
             </w:r>
           </w:p>
         </w:tc>
@@ -2634,7 +2634,7 @@
                 <w:color w:val="1E293B"/>
                 <w:sz w:val="18"/>
               </w:rPr>
-              <w:t>employment_data</w:t>
+              <w:t>employment_data, migration_data</w:t>
             </w:r>
           </w:p>
         </w:tc>
@@ -2661,7 +2661,7 @@
                 <w:color w:val="1E293B"/>
                 <w:sz w:val="18"/>
               </w:rPr>
-              <w:t>Indirect — FRED is the transport; underlying source is BLS</w:t>
+              <w:t>Indirect — FRED is a transport layer. Direct BLS/Census APIs are now the primary path for all 199 markets.</w:t>
             </w:r>
           </w:p>
         </w:tc>
@@ -2688,7 +2688,7 @@
                 <w:color w:val="1E293B"/>
                 <w:sz w:val="18"/>
               </w:rPr>
-              <w:t>FRED only covers ~60 top metros directly; small metros must go straight to Census BPS</w:t>
+              <w:t>FRED only covers ~60 top metros. Replaced by direct Census BPS, BLS v2 API, and Census PEP CSV for full coverage.</w:t>
             </w:r>
           </w:p>
         </w:tc>
@@ -10515,7 +10515,7 @@
                 <w:color w:val="1E293B"/>
                 <w:sz w:val="18"/>
               </w:rPr>
-              <w:t>Zillow ZHVI · 4 unmatched markets</w:t>
+              <w:t>Puerto Rico metros (2 markets)</w:t>
             </w:r>
           </w:p>
         </w:tc>
@@ -10541,7 +10541,7 @@
                 <w:color w:val="1E293B"/>
                 <w:sz w:val="18"/>
               </w:rPr>
-              <w:t>Aguadilla-Isabela PR, San Juan-Carolina-Caguas PR, Dayton-Kettering OH, Prescott Valley-Prescott AZ. No Zillow coverage at all.</w:t>
+              <w:t>Aguadilla-Isabela PR and San Juan-Bayamón PR lack Census PEP population data, Zillow ZHVI, and FHFA HPI. Census excludes PR from the metro-level PEP CSV.</w:t>
             </w:r>
           </w:p>
         </w:tc>
@@ -10567,7 +10567,7 @@
                 <w:color w:val="1E293B"/>
                 <w:sz w:val="18"/>
               </w:rPr>
-              <w:t>Business Case Organic model cannot compute for these markets (returns empty result with a warning).</w:t>
+              <w:t>Scores computed from available inputs only (employment, income, QCEW). Missing components are null, not imputed.</w:t>
             </w:r>
           </w:p>
         </w:tc>
@@ -10593,7 +10593,7 @@
                 <w:color w:val="1E293B"/>
                 <w:sz w:val="18"/>
               </w:rPr>
-              <w:t>Phase 4 — source a PR-specific + Ohio-specific home-value feed, or document as out-of-scope.</w:t>
+              <w:t>Accept as structural — these markets have limited federal data coverage by design.</w:t>
             </w:r>
           </w:p>
         </w:tc>
@@ -10622,7 +10622,7 @@
                 <w:color w:val="1E293B"/>
                 <w:sz w:val="18"/>
               </w:rPr>
-              <w:t>Private builder market presence</w:t>
+              <w:t>Zillow ZHVI · 4 unmatched markets</w:t>
             </w:r>
           </w:p>
         </w:tc>
@@ -10649,7 +10649,7 @@
                 <w:color w:val="1E293B"/>
                 <w:sz w:val="18"/>
               </w:rPr>
-              <w:t>Competitive Landscape card covers only ~18 public builders via earnings narratives. Regional + private builders invisible.</w:t>
+              <w:t>2 PR metros, Dayton-Kettering OH, Prescott Valley-Prescott AZ. No Zillow coverage.</w:t>
             </w:r>
           </w:p>
         </w:tc>
@@ -10676,7 +10676,7 @@
                 <w:color w:val="1E293B"/>
                 <w:sz w:val="18"/>
               </w:rPr>
-              <w:t>Coverage footer on the Competitive Landscape card flags the gap. Card is public-only by design in v1.</w:t>
+              <w:t>Business Case Organic model cannot compute for these markets (returns empty result with a warning).</w:t>
             </w:r>
           </w:p>
         </w:tc>
@@ -10703,7 +10703,7 @@
                 <w:color w:val="1E293B"/>
                 <w:sz w:val="18"/>
               </w:rPr>
-              <w:t>Phase 4.13 — build private-builder pipeline (NAHB Builder 400 paid feed, Zonda, or county-permit scraping).</w:t>
+              <w:t>Accept for PR. Dayton/Prescott may resolve with CBSA code matching update.</w:t>
             </w:r>
           </w:p>
         </w:tc>
@@ -10731,7 +10731,7 @@
                 <w:color w:val="1E293B"/>
                 <w:sz w:val="18"/>
               </w:rPr>
-              <w:t>Acquisition cost modeling</w:t>
+              <w:t>QCEW trade data · state-level proxy for 147 markets</w:t>
             </w:r>
           </w:p>
         </w:tc>
@@ -10757,7 +10757,7 @@
                 <w:color w:val="1E293B"/>
                 <w:sz w:val="18"/>
               </w:rPr>
-              <w:t>Current v1 shows the Competitive Landscape as a list; no per-builder cost math. The v1 Acquisition Targets card is just a list — the CEO decides suitability.</w:t>
+              <w:t>BLS suppresses NAICS 238x (4-digit construction trades) for smaller metros due to employer disclosure rules. 147 of 199 markets use state-level trade wages as proxy.</w:t>
             </w:r>
           </w:p>
         </w:tc>
@@ -10783,7 +10783,7 @@
                 <w:color w:val="1E293B"/>
                 <w:sz w:val="18"/>
               </w:rPr>
-              <w:t>Clearly labeled. Prior 'goodwill premium per unit' number was retired in Phase 3.10b as misleading.</w:t>
+              <w:t>State-level proxy is clearly sourced ('bls_qcew' in the data). Same trade wage trends apply statewide — less precise than metro-level but better than null.</w:t>
             </w:r>
           </w:p>
         </w:tc>
@@ -10809,7 +10809,7 @@
                 <w:color w:val="1E293B"/>
                 <w:sz w:val="18"/>
               </w:rPr>
-              <w:t>Phase 4.14 — rebuild Acquisition Entry model with acquirer-vs-target scale logic, book value, integration cost. Depends on 4.13.</w:t>
+              <w:t>Accept as structural. Metro-level 238x is only published for ~50 largest MSAs.</w:t>
             </w:r>
           </w:p>
         </w:tc>
@@ -10838,7 +10838,7 @@
                 <w:color w:val="1E293B"/>
                 <w:sz w:val="18"/>
               </w:rPr>
-              <w:t>OEWS coverage limits</w:t>
+              <w:t>Private builder market presence</w:t>
             </w:r>
           </w:p>
         </w:tc>
@@ -10865,7 +10865,7 @@
                 <w:color w:val="1E293B"/>
                 <w:sz w:val="18"/>
               </w:rPr>
-              <w:t>Only ~7 of 52 tracked markets have OEWS data at the metro level.</w:t>
+              <w:t>Competitive Landscape card covers only ~18 public builders via earnings narratives. Regional + private builders invisible.</w:t>
             </w:r>
           </w:p>
         </w:tc>
@@ -10892,7 +10892,7 @@
                 <w:color w:val="1E293B"/>
                 <w:sz w:val="18"/>
               </w:rPr>
-              <w:t>Filter 6 uses QCEW as primary and falls back to OEWS where available; scoring is robust to OEWS gaps.</w:t>
+              <w:t>Coverage footer on the card flags the gap. Card is public-only by design.</w:t>
             </w:r>
           </w:p>
         </w:tc>
@@ -10919,7 +10919,7 @@
                 <w:color w:val="1E293B"/>
                 <w:sz w:val="18"/>
               </w:rPr>
-              <w:t>Accept as structural — BLS does not publish metro-level OEWS for smaller metros.</w:t>
+              <w:t>Phase 5.4 — private-builder pipeline (data source decision pending).</w:t>
             </w:r>
           </w:p>
         </w:tc>
@@ -10947,7 +10947,7 @@
                 <w:color w:val="1E293B"/>
                 <w:sz w:val="18"/>
               </w:rPr>
-              <w:t>ACS income lag</w:t>
+              <w:t>Acquisition cost modeling</w:t>
             </w:r>
           </w:p>
         </w:tc>
@@ -10973,7 +10973,7 @@
                 <w:color w:val="1E293B"/>
                 <w:sz w:val="18"/>
               </w:rPr>
-              <w:t>One-year structural lag on median household income.</w:t>
+              <w:t>Acquisition Targets card is a plain list — no per-builder cost math.</w:t>
             </w:r>
           </w:p>
         </w:tc>
@@ -10999,7 +10999,7 @@
                 <w:color w:val="1E293B"/>
                 <w:sz w:val="18"/>
               </w:rPr>
-              <w:t>Documented; Filter 5 operates on the latest available vintage.</w:t>
+              <w:t>Clearly labeled. Prior 'goodwill premium per unit' was retired in Phase 3.10b as misleading.</w:t>
             </w:r>
           </w:p>
         </w:tc>
@@ -11025,7 +11025,7 @@
                 <w:color w:val="1E293B"/>
                 <w:sz w:val="18"/>
               </w:rPr>
-              <w:t>No fix available. Accept.</w:t>
+              <w:t>Phase 5.5 — total-cost-of-entry model. Depends on 5.4.</w:t>
             </w:r>
           </w:p>
         </w:tc>
@@ -11054,7 +11054,7 @@
                 <w:color w:val="1E293B"/>
                 <w:sz w:val="18"/>
               </w:rPr>
-              <w:t>FRED / CES / LAUS mirror lag</w:t>
+              <w:t>OEWS coverage limits</w:t>
             </w:r>
           </w:p>
         </w:tc>
@@ -11081,7 +11081,7 @@
                 <w:color w:val="1E293B"/>
                 <w:sz w:val="18"/>
               </w:rPr>
-              <w:t>~15-day delay vs direct BLS.</w:t>
+              <w:t>Only ~7 of 199 tracked markets have OEWS data at the metro level.</w:t>
             </w:r>
           </w:p>
         </w:tc>
@@ -11108,7 +11108,7 @@
                 <w:color w:val="1E293B"/>
                 <w:sz w:val="18"/>
               </w:rPr>
-              <w:t>Acceptable for monthly cadence.</w:t>
+              <w:t>Filter 6 uses QCEW as primary; OEWS is supplemental where available.</w:t>
             </w:r>
           </w:p>
         </w:tc>
@@ -11135,7 +11135,7 @@
                 <w:color w:val="1E293B"/>
                 <w:sz w:val="18"/>
               </w:rPr>
-              <w:t>Accept — rate limits and reliability are worth the 2-week lag.</w:t>
+              <w:t>Accept as structural — BLS does not publish metro-level OEWS for smaller metros.</w:t>
             </w:r>
           </w:p>
         </w:tc>
@@ -11163,7 +11163,7 @@
                 <w:color w:val="1E293B"/>
                 <w:sz w:val="18"/>
               </w:rPr>
-              <w:t>EDGAR parsing — lot data</w:t>
+              <w:t>ACS income lag</w:t>
             </w:r>
           </w:p>
         </w:tc>
@@ -11189,7 +11189,7 @@
                 <w:color w:val="1E293B"/>
                 <w:sz w:val="18"/>
               </w:rPr>
-              <w:t>Some builders disclose lot positions only in 10-K (annual), not 8-K (quarterly). Phase 3 known gap.</w:t>
+              <w:t>One-year structural lag on median household income.</w:t>
             </w:r>
           </w:p>
         </w:tc>
@@ -11215,7 +11215,7 @@
                 <w:color w:val="1E293B"/>
                 <w:sz w:val="18"/>
               </w:rPr>
-              <w:t>Competitive Landscape data is narrative-derived and unaffected. Phase 3.11 Acquisition rebuild will need to handle this.</w:t>
+              <w:t>Documented; Filter 5 operates on the latest available vintage.</w:t>
             </w:r>
           </w:p>
         </w:tc>
@@ -11241,7 +11241,7 @@
                 <w:color w:val="1E293B"/>
                 <w:sz w:val="18"/>
               </w:rPr>
-              <w:t>StrategemOps parser enhancement (cross-project).</w:t>
+              <w:t>No fix available. Accept.</w:t>
             </w:r>
           </w:p>
         </w:tc>
@@ -11270,7 +11270,7 @@
                 <w:color w:val="1E293B"/>
                 <w:sz w:val="18"/>
               </w:rPr>
-              <w:t>Sentiment scoring model</w:t>
+              <w:t>Census PEP population lag</w:t>
             </w:r>
           </w:p>
         </w:tc>
@@ -11297,7 +11297,7 @@
                 <w:color w:val="1E293B"/>
                 <w:sz w:val="18"/>
               </w:rPr>
-              <w:t>ops_sentiment_scores still on gpt-4.1-mini; upgrade to gpt-4.1 is deferred.</w:t>
+              <w:t>~18 month lag. Latest available is July 2024 estimates (released Dec 2024).</w:t>
             </w:r>
           </w:p>
         </w:tc>
@@ -11324,7 +11324,223 @@
                 <w:color w:val="1E293B"/>
                 <w:sz w:val="18"/>
               </w:rPr>
-              <w:t>Not currently surfaced in StrategemSignal; will be upgraded before the feature lands.</w:t>
+              <w:t>Annual frequency is appropriate for population — it doesn't change fast enough to need monthly updates.</w:t>
+            </w:r>
+          </w:p>
+        </w:tc>
+        <w:tc>
+          <w:tcPr>
+            <w:tcW w:type="dxa" w:w="3535"/>
+            <w:shd w:val="clear" w:color="auto" w:fill="FFFBF5"/>
+            <w:vAlign w:val="top"/>
+            <w:tcBorders>
+              <w:top w:val="single" w:sz="4" w:color="E5E7EB"/>
+              <w:left w:val="single" w:sz="4" w:color="E5E7EB"/>
+              <w:bottom w:val="single" w:sz="4" w:color="E5E7EB"/>
+              <w:right w:val="single" w:sz="4" w:color="E5E7EB"/>
+            </w:tcBorders>
+          </w:tcPr>
+          <w:p>
+            <w:pPr>
+              <w:jc w:val="left"/>
+            </w:pPr>
+            <w:r>
+              <w:rPr>
+                <w:rFonts w:ascii="Calibri" w:hAnsi="Calibri"/>
+                <w:b w:val="0"/>
+                <w:color w:val="1E293B"/>
+                <w:sz w:val="18"/>
+              </w:rPr>
+              <w:t>Accept as structural. Census PEP is the authoritative source.</w:t>
+            </w:r>
+          </w:p>
+        </w:tc>
+      </w:tr>
+      <w:tr>
+        <w:tc>
+          <w:tcPr>
+            <w:tcW w:type="dxa" w:w="3535"/>
+            <w:vAlign w:val="top"/>
+            <w:tcBorders>
+              <w:top w:val="single" w:sz="4" w:color="E5E7EB"/>
+              <w:left w:val="single" w:sz="4" w:color="E5E7EB"/>
+              <w:bottom w:val="single" w:sz="4" w:color="E5E7EB"/>
+              <w:right w:val="single" w:sz="4" w:color="E5E7EB"/>
+            </w:tcBorders>
+          </w:tcPr>
+          <w:p>
+            <w:pPr>
+              <w:jc w:val="left"/>
+            </w:pPr>
+            <w:r>
+              <w:rPr>
+                <w:rFonts w:ascii="Calibri" w:hAnsi="Calibri"/>
+                <w:b w:val="0"/>
+                <w:color w:val="1E293B"/>
+                <w:sz w:val="18"/>
+              </w:rPr>
+              <w:t>EDGAR parsing — lot data</w:t>
+            </w:r>
+          </w:p>
+        </w:tc>
+        <w:tc>
+          <w:tcPr>
+            <w:tcW w:type="dxa" w:w="3535"/>
+            <w:vAlign w:val="top"/>
+            <w:tcBorders>
+              <w:top w:val="single" w:sz="4" w:color="E5E7EB"/>
+              <w:left w:val="single" w:sz="4" w:color="E5E7EB"/>
+              <w:bottom w:val="single" w:sz="4" w:color="E5E7EB"/>
+              <w:right w:val="single" w:sz="4" w:color="E5E7EB"/>
+            </w:tcBorders>
+          </w:tcPr>
+          <w:p>
+            <w:pPr>
+              <w:jc w:val="left"/>
+            </w:pPr>
+            <w:r>
+              <w:rPr>
+                <w:rFonts w:ascii="Calibri" w:hAnsi="Calibri"/>
+                <w:b w:val="0"/>
+                <w:color w:val="1E293B"/>
+                <w:sz w:val="18"/>
+              </w:rPr>
+              <w:t>Some builders disclose lot positions only in 10-K (annual), not 8-K (quarterly).</w:t>
+            </w:r>
+          </w:p>
+        </w:tc>
+        <w:tc>
+          <w:tcPr>
+            <w:tcW w:type="dxa" w:w="3535"/>
+            <w:vAlign w:val="top"/>
+            <w:tcBorders>
+              <w:top w:val="single" w:sz="4" w:color="E5E7EB"/>
+              <w:left w:val="single" w:sz="4" w:color="E5E7EB"/>
+              <w:bottom w:val="single" w:sz="4" w:color="E5E7EB"/>
+              <w:right w:val="single" w:sz="4" w:color="E5E7EB"/>
+            </w:tcBorders>
+          </w:tcPr>
+          <w:p>
+            <w:pPr>
+              <w:jc w:val="left"/>
+            </w:pPr>
+            <w:r>
+              <w:rPr>
+                <w:rFonts w:ascii="Calibri" w:hAnsi="Calibri"/>
+                <w:b w:val="0"/>
+                <w:color w:val="1E293B"/>
+                <w:sz w:val="18"/>
+              </w:rPr>
+              <w:t>Competitive Landscape data is narrative-derived and unaffected.</w:t>
+            </w:r>
+          </w:p>
+        </w:tc>
+        <w:tc>
+          <w:tcPr>
+            <w:tcW w:type="dxa" w:w="3535"/>
+            <w:vAlign w:val="top"/>
+            <w:tcBorders>
+              <w:top w:val="single" w:sz="4" w:color="E5E7EB"/>
+              <w:left w:val="single" w:sz="4" w:color="E5E7EB"/>
+              <w:bottom w:val="single" w:sz="4" w:color="E5E7EB"/>
+              <w:right w:val="single" w:sz="4" w:color="E5E7EB"/>
+            </w:tcBorders>
+          </w:tcPr>
+          <w:p>
+            <w:pPr>
+              <w:jc w:val="left"/>
+            </w:pPr>
+            <w:r>
+              <w:rPr>
+                <w:rFonts w:ascii="Calibri" w:hAnsi="Calibri"/>
+                <w:b w:val="0"/>
+                <w:color w:val="1E293B"/>
+                <w:sz w:val="18"/>
+              </w:rPr>
+              <w:t>StrategemOps parser enhancement (cross-project).</w:t>
+            </w:r>
+          </w:p>
+        </w:tc>
+      </w:tr>
+      <w:tr>
+        <w:tc>
+          <w:tcPr>
+            <w:tcW w:type="dxa" w:w="3535"/>
+            <w:shd w:val="clear" w:color="auto" w:fill="FFFBF5"/>
+            <w:vAlign w:val="top"/>
+            <w:tcBorders>
+              <w:top w:val="single" w:sz="4" w:color="E5E7EB"/>
+              <w:left w:val="single" w:sz="4" w:color="E5E7EB"/>
+              <w:bottom w:val="single" w:sz="4" w:color="E5E7EB"/>
+              <w:right w:val="single" w:sz="4" w:color="E5E7EB"/>
+            </w:tcBorders>
+          </w:tcPr>
+          <w:p>
+            <w:pPr>
+              <w:jc w:val="left"/>
+            </w:pPr>
+            <w:r>
+              <w:rPr>
+                <w:rFonts w:ascii="Calibri" w:hAnsi="Calibri"/>
+                <w:b w:val="0"/>
+                <w:color w:val="1E293B"/>
+                <w:sz w:val="18"/>
+              </w:rPr>
+              <w:t>Sentiment scoring model</w:t>
+            </w:r>
+          </w:p>
+        </w:tc>
+        <w:tc>
+          <w:tcPr>
+            <w:tcW w:type="dxa" w:w="3535"/>
+            <w:shd w:val="clear" w:color="auto" w:fill="FFFBF5"/>
+            <w:vAlign w:val="top"/>
+            <w:tcBorders>
+              <w:top w:val="single" w:sz="4" w:color="E5E7EB"/>
+              <w:left w:val="single" w:sz="4" w:color="E5E7EB"/>
+              <w:bottom w:val="single" w:sz="4" w:color="E5E7EB"/>
+              <w:right w:val="single" w:sz="4" w:color="E5E7EB"/>
+            </w:tcBorders>
+          </w:tcPr>
+          <w:p>
+            <w:pPr>
+              <w:jc w:val="left"/>
+            </w:pPr>
+            <w:r>
+              <w:rPr>
+                <w:rFonts w:ascii="Calibri" w:hAnsi="Calibri"/>
+                <w:b w:val="0"/>
+                <w:color w:val="1E293B"/>
+                <w:sz w:val="18"/>
+              </w:rPr>
+              <w:t>ops_sentiment_scores still on gpt-4.1-mini; upgrade to gpt-4.1 is deferred.</w:t>
+            </w:r>
+          </w:p>
+        </w:tc>
+        <w:tc>
+          <w:tcPr>
+            <w:tcW w:type="dxa" w:w="3535"/>
+            <w:shd w:val="clear" w:color="auto" w:fill="FFFBF5"/>
+            <w:vAlign w:val="top"/>
+            <w:tcBorders>
+              <w:top w:val="single" w:sz="4" w:color="E5E7EB"/>
+              <w:left w:val="single" w:sz="4" w:color="E5E7EB"/>
+              <w:bottom w:val="single" w:sz="4" w:color="E5E7EB"/>
+              <w:right w:val="single" w:sz="4" w:color="E5E7EB"/>
+            </w:tcBorders>
+          </w:tcPr>
+          <w:p>
+            <w:pPr>
+              <w:jc w:val="left"/>
+            </w:pPr>
+            <w:r>
+              <w:rPr>
+                <w:rFonts w:ascii="Calibri" w:hAnsi="Calibri"/>
+                <w:b w:val="0"/>
+                <w:color w:val="1E293B"/>
+                <w:sz w:val="18"/>
+              </w:rPr>
+              <w:t>Not currently surfaced in StrategemSignal.</w:t>
             </w:r>
           </w:p>
         </w:tc>

</xml_diff>